<commit_message>
Portada y cronograma con un solo alumno
</commit_message>
<xml_diff>
--- a/global-retail-project/output/DMD941_Proyecto_Fase_1.docx
+++ b/global-retail-project/output/DMD941_Proyecto_Fase_1.docx
@@ -138,7 +138,7 @@
           <w:i w:val="0"/>
           <w:sz w:val="24"/>
         </w:rPr>
-        <w:t>Integrantes</w:t>
+        <w:t>Alumno</w:t>
       </w:r>
     </w:p>
     <w:tbl>
@@ -204,72 +204,6 @@
           <w:p>
             <w:r>
               <w:t>MZ232727</w:t>
-            </w:r>
-          </w:p>
-        </w:tc>
-      </w:tr>
-      <w:tr>
-        <w:tc>
-          <w:tcPr>
-            <w:tcW w:type="dxa" w:w="5472"/>
-          </w:tcPr>
-          <w:p>
-            <w:r>
-              <w:t>Nombre del integrante 2</w:t>
-            </w:r>
-          </w:p>
-        </w:tc>
-        <w:tc>
-          <w:tcPr>
-            <w:tcW w:type="dxa" w:w="2304"/>
-          </w:tcPr>
-          <w:p>
-            <w:r>
-              <w:t>Carné</w:t>
-            </w:r>
-          </w:p>
-        </w:tc>
-      </w:tr>
-      <w:tr>
-        <w:tc>
-          <w:tcPr>
-            <w:tcW w:type="dxa" w:w="5472"/>
-          </w:tcPr>
-          <w:p>
-            <w:r>
-              <w:t>Nombre del integrante 3</w:t>
-            </w:r>
-          </w:p>
-        </w:tc>
-        <w:tc>
-          <w:tcPr>
-            <w:tcW w:type="dxa" w:w="2304"/>
-          </w:tcPr>
-          <w:p>
-            <w:r>
-              <w:t>Carné</w:t>
-            </w:r>
-          </w:p>
-        </w:tc>
-      </w:tr>
-      <w:tr>
-        <w:tc>
-          <w:tcPr>
-            <w:tcW w:type="dxa" w:w="5472"/>
-          </w:tcPr>
-          <w:p>
-            <w:r>
-              <w:t>Nombre del integrante 4</w:t>
-            </w:r>
-          </w:p>
-        </w:tc>
-        <w:tc>
-          <w:tcPr>
-            <w:tcW w:type="dxa" w:w="2304"/>
-          </w:tcPr>
-          <w:p>
-            <w:r>
-              <w:t>Carné</w:t>
             </w:r>
           </w:p>
         </w:tc>
@@ -5015,7 +4949,7 @@
               <w:rPr>
                 <w:sz w:val="19"/>
               </w:rPr>
-              <w:t>Integrante 1</w:t>
+              <w:t>Kevin Menéndez</w:t>
             </w:r>
           </w:p>
         </w:tc>
@@ -5107,7 +5041,7 @@
               <w:rPr>
                 <w:sz w:val="19"/>
               </w:rPr>
-              <w:t>Integrante 1</w:t>
+              <w:t>Kevin Menéndez</w:t>
             </w:r>
           </w:p>
         </w:tc>
@@ -5193,7 +5127,7 @@
               <w:rPr>
                 <w:sz w:val="19"/>
               </w:rPr>
-              <w:t>Integrante 2</w:t>
+              <w:t>Kevin Menéndez</w:t>
             </w:r>
           </w:p>
         </w:tc>
@@ -5285,7 +5219,7 @@
               <w:rPr>
                 <w:sz w:val="19"/>
               </w:rPr>
-              <w:t>Integrante 2</w:t>
+              <w:t>Kevin Menéndez</w:t>
             </w:r>
           </w:p>
         </w:tc>
@@ -5371,7 +5305,7 @@
               <w:rPr>
                 <w:sz w:val="19"/>
               </w:rPr>
-              <w:t>Integrante 3</w:t>
+              <w:t>Kevin Menéndez</w:t>
             </w:r>
           </w:p>
         </w:tc>
@@ -5463,7 +5397,7 @@
               <w:rPr>
                 <w:sz w:val="19"/>
               </w:rPr>
-              <w:t>Integrante 3</w:t>
+              <w:t>Kevin Menéndez</w:t>
             </w:r>
           </w:p>
         </w:tc>
@@ -5549,7 +5483,7 @@
               <w:rPr>
                 <w:sz w:val="19"/>
               </w:rPr>
-              <w:t>Integrante 4</w:t>
+              <w:t>Kevin Menéndez</w:t>
             </w:r>
           </w:p>
         </w:tc>
@@ -5641,7 +5575,7 @@
               <w:rPr>
                 <w:sz w:val="19"/>
               </w:rPr>
-              <w:t>Integrante 4</w:t>
+              <w:t>Kevin Menéndez</w:t>
             </w:r>
           </w:p>
         </w:tc>
@@ -5727,7 +5661,7 @@
               <w:rPr>
                 <w:sz w:val="19"/>
               </w:rPr>
-              <w:t>Todo el equipo</w:t>
+              <w:t>Kevin Menéndez</w:t>
             </w:r>
           </w:p>
         </w:tc>
@@ -5819,7 +5753,7 @@
               <w:rPr>
                 <w:sz w:val="19"/>
               </w:rPr>
-              <w:t>Todo el equipo</w:t>
+              <w:t>Kevin Menéndez</w:t>
             </w:r>
           </w:p>
         </w:tc>

</xml_diff>